<commit_message>
add french version to submission for final review
</commit_message>
<xml_diff>
--- a/docs/index.docx
+++ b/docs/index.docx
@@ -578,7 +578,7 @@
         <w:t xml:space="preserve">), and the third one six months after their service civique (</w:t>
       </w:r>
       <w:r>
-        <w:t xml:space="preserve">“q1”</w:t>
+        <w:t xml:space="preserve">“q3”</w:t>
       </w:r>
       <w:r>
         <w:t xml:space="preserve">). Answering these questionnaires is voluntary, and response rates typically decline considerably from the first to the third questionnaire. These declining response rates are referred to as</w:t>
@@ -2477,7 +2477,7 @@
         </w:r>
       </w:hyperlink>
       <w:r>
-        <w:t xml:space="preserve">, older volunteers tend to be more satisfied than younger ones; more educated volunteers tend to be more satisfied than less educated; refugees tend to have less ruptures than non-refugees; volunteers in the</w:t>
+        <w:t xml:space="preserve">, older volunteers tend to be more satisfied than younger ones; more educated volunteers tend to be more satisfied than less educated; volunteers in the</w:t>
       </w:r>
       <w:r>
         <w:t xml:space="preserve"> </w:t>
@@ -10369,7 +10369,7 @@
         <w:pStyle w:val="Caption"/>
       </w:pPr>
       <w:r>
-        <w:t xml:space="preserve">Differences in Cinéma &amp; Citoyennetévs vs. other programs along demographic factors.</w:t>
+        <w:t xml:space="preserve">Differences in Cinéma &amp; Citoyenneté vs. other programs along demographic factors.</w:t>
       </w:r>
     </w:p>
     <w:p>
@@ -11434,7 +11434,7 @@
         <w:pStyle w:val="Caption"/>
       </w:pPr>
       <w:r>
-        <w:t xml:space="preserve">Differences in Cinéma &amp; Citoyennetévs vs. other programs along demographic factors</w:t>
+        <w:t xml:space="preserve">Differences in Cinéma &amp; Citoyenneté vs. other programs along demographic factors</w:t>
       </w:r>
     </w:p>
     <w:p>

</xml_diff>